<commit_message>
Review sheet: table borders
Co-Authored-By: Claude Opus 5.5 (1M context) <noreply@anthropic.com>
Claude-Session: https://claude.ai/code/session_01KDMyrk7oWH5NcBVCvciDK9
</commit_message>
<xml_diff>
--- a/docs/Watchlog - Template Wording Review.docx
+++ b/docs/Watchlog - Template Wording Review.docx
@@ -92,6 +92,14 @@
         <w:tblW w:type="auto" w:w="0"/>
         <w:tblLook w:firstRow="1" w:lastRow="0" w:firstColumn="0" w:lastColumn="0" w:noHBand="0" w:noVBand="0" w:val="0020"/>
         <w:jc w:val="start"/>
+        <w:tblBorders>
+          <w:top w:val="single" w:sz="4" w:color="999999"/>
+          <w:left w:val="single" w:sz="4" w:color="999999"/>
+          <w:bottom w:val="single" w:sz="4" w:color="999999"/>
+          <w:right w:val="single" w:sz="4" w:color="999999"/>
+          <w:insideH w:val="single" w:sz="4" w:color="999999"/>
+          <w:insideV w:val="single" w:sz="4" w:color="999999"/>
+        </w:tblBorders>
       </w:tblPr>
       <w:tblGrid>
         <w:gridCol w:w="1980"/>
@@ -414,6 +422,14 @@
         <w:tblW w:type="auto" w:w="0"/>
         <w:tblLook w:firstRow="1" w:lastRow="0" w:firstColumn="0" w:lastColumn="0" w:noHBand="0" w:noVBand="0" w:val="0020"/>
         <w:jc w:val="start"/>
+        <w:tblBorders>
+          <w:top w:val="single" w:sz="4" w:color="999999"/>
+          <w:left w:val="single" w:sz="4" w:color="999999"/>
+          <w:bottom w:val="single" w:sz="4" w:color="999999"/>
+          <w:right w:val="single" w:sz="4" w:color="999999"/>
+          <w:insideH w:val="single" w:sz="4" w:color="999999"/>
+          <w:insideV w:val="single" w:sz="4" w:color="999999"/>
+        </w:tblBorders>
       </w:tblPr>
       <w:tblGrid>
         <w:gridCol w:w="1980"/>
@@ -589,6 +605,14 @@
         <w:tblW w:type="auto" w:w="0"/>
         <w:tblLook w:firstRow="1" w:lastRow="0" w:firstColumn="0" w:lastColumn="0" w:noHBand="0" w:noVBand="0" w:val="0020"/>
         <w:jc w:val="start"/>
+        <w:tblBorders>
+          <w:top w:val="single" w:sz="4" w:color="999999"/>
+          <w:left w:val="single" w:sz="4" w:color="999999"/>
+          <w:bottom w:val="single" w:sz="4" w:color="999999"/>
+          <w:right w:val="single" w:sz="4" w:color="999999"/>
+          <w:insideH w:val="single" w:sz="4" w:color="999999"/>
+          <w:insideV w:val="single" w:sz="4" w:color="999999"/>
+        </w:tblBorders>
       </w:tblPr>
       <w:tblGrid>
         <w:gridCol w:w="1980"/>
@@ -1205,6 +1229,14 @@
         <w:tblW w:type="auto" w:w="0"/>
         <w:tblLook w:firstRow="1" w:lastRow="0" w:firstColumn="0" w:lastColumn="0" w:noHBand="0" w:noVBand="0" w:val="0020"/>
         <w:jc w:val="start"/>
+        <w:tblBorders>
+          <w:top w:val="single" w:sz="4" w:color="999999"/>
+          <w:left w:val="single" w:sz="4" w:color="999999"/>
+          <w:bottom w:val="single" w:sz="4" w:color="999999"/>
+          <w:right w:val="single" w:sz="4" w:color="999999"/>
+          <w:insideH w:val="single" w:sz="4" w:color="999999"/>
+          <w:insideV w:val="single" w:sz="4" w:color="999999"/>
+        </w:tblBorders>
       </w:tblPr>
       <w:tblGrid>
         <w:gridCol w:w="1980"/>
@@ -1576,6 +1608,14 @@
         <w:tblW w:type="auto" w:w="0"/>
         <w:tblLook w:firstRow="1" w:lastRow="0" w:firstColumn="0" w:lastColumn="0" w:noHBand="0" w:noVBand="0" w:val="0020"/>
         <w:jc w:val="start"/>
+        <w:tblBorders>
+          <w:top w:val="single" w:sz="4" w:color="999999"/>
+          <w:left w:val="single" w:sz="4" w:color="999999"/>
+          <w:bottom w:val="single" w:sz="4" w:color="999999"/>
+          <w:right w:val="single" w:sz="4" w:color="999999"/>
+          <w:insideH w:val="single" w:sz="4" w:color="999999"/>
+          <w:insideV w:val="single" w:sz="4" w:color="999999"/>
+        </w:tblBorders>
       </w:tblPr>
       <w:tblGrid>
         <w:gridCol w:w="1980"/>
@@ -1947,6 +1987,14 @@
         <w:tblW w:type="auto" w:w="0"/>
         <w:tblLook w:firstRow="1" w:lastRow="0" w:firstColumn="0" w:lastColumn="0" w:noHBand="0" w:noVBand="0" w:val="0020"/>
         <w:jc w:val="start"/>
+        <w:tblBorders>
+          <w:top w:val="single" w:sz="4" w:color="999999"/>
+          <w:left w:val="single" w:sz="4" w:color="999999"/>
+          <w:bottom w:val="single" w:sz="4" w:color="999999"/>
+          <w:right w:val="single" w:sz="4" w:color="999999"/>
+          <w:insideH w:val="single" w:sz="4" w:color="999999"/>
+          <w:insideV w:val="single" w:sz="4" w:color="999999"/>
+        </w:tblBorders>
       </w:tblPr>
       <w:tblGrid>
         <w:gridCol w:w="1980"/>
@@ -2220,6 +2268,14 @@
         <w:tblW w:type="auto" w:w="0"/>
         <w:tblLook w:firstRow="1" w:lastRow="0" w:firstColumn="0" w:lastColumn="0" w:noHBand="0" w:noVBand="0" w:val="0020"/>
         <w:jc w:val="start"/>
+        <w:tblBorders>
+          <w:top w:val="single" w:sz="4" w:color="999999"/>
+          <w:left w:val="single" w:sz="4" w:color="999999"/>
+          <w:bottom w:val="single" w:sz="4" w:color="999999"/>
+          <w:right w:val="single" w:sz="4" w:color="999999"/>
+          <w:insideH w:val="single" w:sz="4" w:color="999999"/>
+          <w:insideV w:val="single" w:sz="4" w:color="999999"/>
+        </w:tblBorders>
       </w:tblPr>
       <w:tblGrid>
         <w:gridCol w:w="1980"/>
@@ -2395,6 +2451,14 @@
         <w:tblW w:type="auto" w:w="0"/>
         <w:tblLook w:firstRow="1" w:lastRow="0" w:firstColumn="0" w:lastColumn="0" w:noHBand="0" w:noVBand="0" w:val="0020"/>
         <w:jc w:val="start"/>
+        <w:tblBorders>
+          <w:top w:val="single" w:sz="4" w:color="999999"/>
+          <w:left w:val="single" w:sz="4" w:color="999999"/>
+          <w:bottom w:val="single" w:sz="4" w:color="999999"/>
+          <w:right w:val="single" w:sz="4" w:color="999999"/>
+          <w:insideH w:val="single" w:sz="4" w:color="999999"/>
+          <w:insideV w:val="single" w:sz="4" w:color="999999"/>
+        </w:tblBorders>
       </w:tblPr>
       <w:tblGrid>
         <w:gridCol w:w="3960"/>

</xml_diff>